<commit_message>
Record Zenodo DOI for v2.0.0
</commit_message>
<xml_diff>
--- a/06_submission/Cover_Letter_Draft.docx
+++ b/06_submission/Cover_Letter_Draft.docx
@@ -15,7 +15,7 @@
           <w:color w:val="000000"/>
           <w:sz w:val="34"/>
         </w:rPr>
-        <w:t>Cover letter draft</w:t>
+        <w:t>Cover letter</w:t>
       </w:r>
     </w:p>
     <w:p>
@@ -313,7 +313,7 @@
         <w:color w:val="5F6B73"/>
         <w:sz w:val="17"/>
       </w:rPr>
-      <w:t>Cover letter draft</w:t>
+      <w:t>Cover letter</w:t>
     </w:r>
   </w:p>
 </w:hdr>

</xml_diff>